<commit_message>
Split request card backs into a separate PnP file for KORNI 15 and add application form drafts.
</commit_message>
<xml_diff>
--- a/output/pnp-prep-instructions.docx
+++ b/output/pnp-prep-instructions.docx
@@ -38,7 +38,7 @@
           <w:b w:val="0"/>
           <w:sz w:val="24"/>
         </w:rPr>
-        <w:t>Распечатайте три файла (ссылки подставите сами):</w:t>
+        <w:t>Распечатайте четыре файла (ссылки подставите сами):</w:t>
       </w:r>
     </w:p>
     <w:p>
@@ -66,7 +66,21 @@
           <w:b w:val="0"/>
           <w:sz w:val="24"/>
         </w:rPr>
-        <w:t>Карты запросов и «Ты восхитителен»: *** Формат A4, альбомная ориентация. Цветная печать крайне желательна (цвета игроков на картах «Ты восхитителен»). Карты – на плотной бумаге.</w:t>
+        <w:t>Карты запросов (лицо) и «Ты восхитителен»: *** Формат A4, альбомная ориентация. Цветная печать крайне желательна (цвета игроков на картах «Ты восхитителен»). Карты – на плотной бумаге.</w:t>
+      </w:r>
+    </w:p>
+    <w:p>
+      <w:pPr>
+        <w:pStyle w:val="ListNumber"/>
+        <w:spacing w:after="40"/>
+      </w:pPr>
+      <w:r>
+        <w:rPr>
+          <w:rFonts w:ascii="Arial" w:hAnsi="Arial" w:cs="Arial"/>
+          <w:b w:val="0"/>
+          <w:sz w:val="24"/>
+        </w:rPr>
+        <w:t>Карты запросов (оборот): *** Формат A4, альбомная ориентация. Тот же лист, что и лица запросов. Карты – на плотной бумаге.</w:t>
       </w:r>
     </w:p>
     <w:p>
@@ -106,7 +120,7 @@
           <w:b w:val="0"/>
           <w:sz w:val="24"/>
         </w:rPr>
-        <w:t>Только карты запросов двусторонние.</w:t>
+        <w:t>Только карты запросов двусторонние. Лица и обороты лежат в разных файлах.</w:t>
       </w:r>
     </w:p>
     <w:p>
@@ -119,7 +133,7 @@
           <w:b w:val="0"/>
           <w:sz w:val="24"/>
         </w:rPr>
-        <w:t>В файле карт:</w:t>
+        <w:t>В файле лиц:</w:t>
       </w:r>
     </w:p>
     <w:p>
@@ -147,21 +161,7 @@
           <w:b w:val="0"/>
           <w:sz w:val="24"/>
         </w:rPr>
-        <w:t>страница 2 – «Карты запросов · ОБОРОТ» того же листа;</w:t>
-      </w:r>
-    </w:p>
-    <w:p>
-      <w:pPr>
-        <w:pStyle w:val="ListBullet"/>
-        <w:spacing w:after="40"/>
-      </w:pPr>
-      <w:r>
-        <w:rPr>
-          <w:rFonts w:ascii="Arial" w:hAnsi="Arial" w:cs="Arial"/>
-          <w:b w:val="0"/>
-          <w:sz w:val="24"/>
-        </w:rPr>
-        <w:t>страница 3 – «Карты «Ты восхитителен»», только лицо, без оборота.</w:t>
+        <w:t>страница 2 – «Карты «Ты восхитителен»», только лицо, без оборота.</w:t>
       </w:r>
     </w:p>
     <w:p>
@@ -174,7 +174,7 @@
           <w:b w:val="0"/>
           <w:sz w:val="24"/>
         </w:rPr>
-        <w:t>Напечатайте страницы 1 и 2 на двух сторонах одного листа. Переворот выберите так, чтобы верх листа остался верхом: после печати текст на обороте читается без поворота страницы. Если лица и рубашки не совпали – смените сторону переворота в настройках принтера.</w:t>
+        <w:t>В файле оборотов одна страница – «Карты запросов · ОБОРОТ». Напечатайте страницу 1 файла лиц и страницу файла оборотов на двух сторонах одного листа. Переворот выберите так, чтобы верх листа остался верхом: после печати текст на обороте читается без поворота страницы. Если лица и рубашки не совпали – смените сторону переворота в настройках принтера.</w:t>
       </w:r>
     </w:p>
     <w:p>

</xml_diff>

<commit_message>
Export PnP and rules to PDF; name files in the print instructions.
</commit_message>
<xml_diff>
--- a/output/pnp-prep-instructions.docx
+++ b/output/pnp-prep-instructions.docx
@@ -38,7 +38,7 @@
           <w:b w:val="0"/>
           <w:sz w:val="24"/>
         </w:rPr>
-        <w:t>Распечатайте четыре файла (ссылки подставите сами):</w:t>
+        <w:t>Распечатайте пять файлов:</w:t>
       </w:r>
     </w:p>
     <w:p>
@@ -52,7 +52,7 @@
           <w:b w:val="0"/>
           <w:sz w:val="24"/>
         </w:rPr>
-        <w:t>Правила: *** Формат A4, книжная ориентация. Цвет не обязателен. Обычная офисная бумага. Не режьте этот файл.</w:t>
+        <w:t>Правила: svet-moy-zerkalce-rules.pdf. Формат A4, книжная ориентация. Цвет не обязателен. Обычная офисная бумага. Не режьте этот файл.</w:t>
       </w:r>
     </w:p>
     <w:p>
@@ -66,7 +66,7 @@
           <w:b w:val="0"/>
           <w:sz w:val="24"/>
         </w:rPr>
-        <w:t>Карты запросов (лицо) и «Ты восхитителен»: *** Формат A4, альбомная ориентация. Цветная печать крайне желательна (цвета игроков на картах «Ты восхитителен»). Карты – на плотной бумаге.</w:t>
+        <w:t>Карты запросов (лицо): svet-moy-zerkalce-cards.pdf. Формат A4, альбомная ориентация. Цветная печать желательна (синие рамки). Карты – на плотной бумаге. Размер карты 88×63 мм.</w:t>
       </w:r>
     </w:p>
     <w:p>
@@ -80,7 +80,7 @@
           <w:b w:val="0"/>
           <w:sz w:val="24"/>
         </w:rPr>
-        <w:t>Карты запросов (оборот): *** Формат A4, альбомная ориентация. Тот же лист, что и лица запросов. Карты – на плотной бумаге.</w:t>
+        <w:t>Карты запросов (оборот): svet-moy-zerkalce-card-backs.pdf. Формат A4, альбомная ориентация. Тот же лист, что и лица запросов. Карты – на плотной бумаге.</w:t>
       </w:r>
     </w:p>
     <w:p>
@@ -94,7 +94,21 @@
           <w:b w:val="0"/>
           <w:sz w:val="24"/>
         </w:rPr>
-        <w:t>Карты букв: *** Можно взять карты букв из другой игры с буквами либо распечатать из этого файла. Формат A4, книжная ориентация. Цвет не обязателен (чёрный текст). Карты – на плотной бумаге.</w:t>
+        <w:t>Карты «Ты восхитителен»: svet-moy-zerkalce-votes.pdf. Формат A4, альбомная ориентация. Печатайте в цвете и на плотной бумаге либо вложите карты в протекторы – карты кидают по столу, обычная офисная бумага мнётся и рвётся.</w:t>
+      </w:r>
+    </w:p>
+    <w:p>
+      <w:pPr>
+        <w:pStyle w:val="ListNumber"/>
+        <w:spacing w:after="40"/>
+      </w:pPr>
+      <w:r>
+        <w:rPr>
+          <w:rFonts w:ascii="Arial" w:hAnsi="Arial" w:cs="Arial"/>
+          <w:b w:val="0"/>
+          <w:sz w:val="24"/>
+        </w:rPr>
+        <w:t>Карты букв: svet-moy-zerkalce-letters.pdf. Можно взять карты букв из другой игры с буквами либо распечатать из этого файла. Формат A4, книжная ориентация. Цвет не обязателен (чёрный текст). Карты – на плотной бумаге.</w:t>
       </w:r>
     </w:p>
     <w:p>
@@ -120,7 +134,7 @@
           <w:b w:val="0"/>
           <w:sz w:val="24"/>
         </w:rPr>
-        <w:t>Только карты запросов двусторонние. Лица и обороты лежат в разных файлах.</w:t>
+        <w:t>Только карты запросов двусторонние. Лица – svet-moy-zerkalce-cards.pdf, обороты – svet-moy-zerkalce-card-backs.pdf.</w:t>
       </w:r>
     </w:p>
     <w:p>
@@ -133,48 +147,7 @@
           <w:b w:val="0"/>
           <w:sz w:val="24"/>
         </w:rPr>
-        <w:t>В файле лиц:</w:t>
-      </w:r>
-    </w:p>
-    <w:p>
-      <w:pPr>
-        <w:pStyle w:val="ListBullet"/>
-        <w:spacing w:after="40"/>
-      </w:pPr>
-      <w:r>
-        <w:rPr>
-          <w:rFonts w:ascii="Arial" w:hAnsi="Arial" w:cs="Arial"/>
-          <w:b w:val="0"/>
-          <w:sz w:val="24"/>
-        </w:rPr>
-        <w:t>страница 1 – «Карты запросов · ЛИЦО»;</w:t>
-      </w:r>
-    </w:p>
-    <w:p>
-      <w:pPr>
-        <w:pStyle w:val="ListBullet"/>
-        <w:spacing w:after="40"/>
-      </w:pPr>
-      <w:r>
-        <w:rPr>
-          <w:rFonts w:ascii="Arial" w:hAnsi="Arial" w:cs="Arial"/>
-          <w:b w:val="0"/>
-          <w:sz w:val="24"/>
-        </w:rPr>
-        <w:t>страница 2 – «Карты «Ты восхитителен»», только лицо, без оборота.</w:t>
-      </w:r>
-    </w:p>
-    <w:p>
-      <w:pPr>
-        <w:spacing w:after="80"/>
-      </w:pPr>
-      <w:r>
-        <w:rPr>
-          <w:rFonts w:ascii="Arial" w:hAnsi="Arial" w:cs="Arial"/>
-          <w:b w:val="0"/>
-          <w:sz w:val="24"/>
-        </w:rPr>
-        <w:t>В файле оборотов одна страница – «Карты запросов · ОБОРОТ». Напечатайте страницу 1 файла лиц и страницу файла оборотов на двух сторонах одного листа. Переворот выберите так, чтобы верх листа остался верхом: после печати текст на обороте читается без поворота страницы. Если лица и рубашки не совпали – смените сторону переворота в настройках принтера.</w:t>
+        <w:t>В svet-moy-zerkalce-cards.pdf несколько страниц – все «Карты запросов · ЛИЦО». В svet-moy-zerkalce-card-backs.pdf столько же страниц – «Карты запросов · ОБОРОТ». Напечатайте страницу N лиц и страницу N оборотов на двух сторонах одного листа. Переворот выберите так, чтобы верх листа остался верхом: после печати текст на обороте читается без поворота страницы. Если лица и рубашки не совпали – смените сторону переворота в настройках принтера.</w:t>
       </w:r>
     </w:p>
     <w:p>
@@ -200,7 +173,7 @@
           <w:b w:val="0"/>
           <w:sz w:val="24"/>
         </w:rPr>
-        <w:t>Страницу с «Ты восхитителен» печатайте односторонне. Все листы букв тоже односторонние: оборот бумаги оставьте пустым. Карта буквы, сыгранная рубашкой вверх, – джокер.</w:t>
+        <w:t>svet-moy-zerkalce-votes.pdf печатайте односторонне. Все листы svet-moy-zerkalce-letters.pdf тоже односторонние: оборот бумаги оставьте пустым. Карта буквы, сыгранная рубашкой вверх, – джокер.</w:t>
       </w:r>
     </w:p>
     <w:p>
@@ -226,7 +199,7 @@
           <w:b w:val="0"/>
           <w:sz w:val="24"/>
         </w:rPr>
-        <w:t>Разрежьте карты по светло-серым линиям реза (границы карт). Подписи листов («ЛИЦО», «ОБОРОТ», «Карты букв») отрежьте и выбросьте.</w:t>
+        <w:t>Разрежьте карты по светло-серым линиям реза (границы карт). Подписи листов («ЛИЦО», «ОБОРОТ», «Ты восхитителен», «Карты букв») отрежьте и выбросьте.</w:t>
       </w:r>
     </w:p>
     <w:p>
@@ -280,7 +253,7 @@
           <w:b w:val="0"/>
           <w:sz w:val="24"/>
         </w:rPr>
-        <w:t>72 односторонние карты букв, если печатаете из предложенного файла;</w:t>
+        <w:t>72 односторонние карты букв, если печатаете из svet-moy-zerkalce-letters.pdf;</w:t>
       </w:r>
     </w:p>
     <w:p>
@@ -333,7 +306,7 @@
           <w:b w:val="0"/>
           <w:sz w:val="24"/>
         </w:rPr>
-        <w:t>Карты букв можно взять из другой игры с буквами либо распечатать из предложенного файла. Для партии нужна поверхность стола, достаточная чтобы раскидать карты букв в центре и кидать карты «Ты восхитителен» к игрокам.</w:t>
+        <w:t>Карты букв можно взять из другой игры с буквами либо распечатать из svet-moy-zerkalce-letters.pdf. Для партии нужна поверхность стола, достаточная чтобы раскидать карты букв в центре и кидать карты «Ты восхитителен» к игрокам.</w:t>
       </w:r>
     </w:p>
     <w:p>
@@ -359,7 +332,7 @@
           <w:b w:val="0"/>
           <w:sz w:val="24"/>
         </w:rPr>
-        <w:t>При возникновении сложностей свяжитесь с Юрием Ямщиковым: yury.yamshchikov@gmail.com</w:t>
+        <w:t>При возникновении сложностей: t.me/tanion, vk.ru/tanion, yury@nxt.ru, +79213189331 (не стесняйтесь звонить / писать при возникновении вопросов).</w:t>
       </w:r>
     </w:p>
     <w:sectPr>

</xml_diff>